<commit_message>
Avances corte 2 Martin
</commit_message>
<xml_diff>
--- a/Formularios LOGT/Martin Villatoro.docx
+++ b/Formularios LOGT/Martin Villatoro.docx
@@ -19,13 +19,13 @@
         <w:tblLook w:val="04A0" w:firstRow="1" w:lastRow="0" w:firstColumn="1" w:lastColumn="0" w:noHBand="0" w:noVBand="1"/>
       </w:tblPr>
       <w:tblGrid>
-        <w:gridCol w:w="731"/>
-        <w:gridCol w:w="705"/>
-        <w:gridCol w:w="705"/>
-        <w:gridCol w:w="1733"/>
-        <w:gridCol w:w="1341"/>
+        <w:gridCol w:w="741"/>
+        <w:gridCol w:w="707"/>
+        <w:gridCol w:w="707"/>
+        <w:gridCol w:w="1728"/>
+        <w:gridCol w:w="1359"/>
         <w:gridCol w:w="603"/>
-        <w:gridCol w:w="3532"/>
+        <w:gridCol w:w="3505"/>
       </w:tblGrid>
       <w:tr>
         <w:tc>
@@ -236,6 +236,972 @@
             </w:tcMar>
           </w:tcPr>
           <w:p>
+            <w:pPr>
+              <w:rPr>
+                <w:b/>
+                <w:bCs/>
+              </w:rPr>
+            </w:pPr>
+            <w:r>
+              <w:rPr>
+                <w:b/>
+                <w:bCs/>
+              </w:rPr>
+              <w:t>22/02</w:t>
+            </w:r>
+          </w:p>
+        </w:tc>
+        <w:tc>
+          <w:tcPr>
+            <w:tcW w:w="0" w:type="auto"/>
+            <w:tcBorders>
+              <w:top w:val="single" w:sz="4" w:space="0" w:color="000000"/>
+              <w:left w:val="single" w:sz="4" w:space="0" w:color="000000"/>
+              <w:bottom w:val="single" w:sz="4" w:space="0" w:color="000000"/>
+              <w:right w:val="single" w:sz="4" w:space="0" w:color="000000"/>
+            </w:tcBorders>
+            <w:tcMar>
+              <w:top w:w="100" w:type="dxa"/>
+              <w:left w:w="100" w:type="dxa"/>
+              <w:bottom w:w="100" w:type="dxa"/>
+              <w:right w:w="100" w:type="dxa"/>
+            </w:tcMar>
+          </w:tcPr>
+          <w:p>
+            <w:pPr>
+              <w:rPr>
+                <w:b/>
+                <w:bCs/>
+              </w:rPr>
+            </w:pPr>
+            <w:r>
+              <w:rPr>
+                <w:b/>
+                <w:bCs/>
+              </w:rPr>
+              <w:t>18:00</w:t>
+            </w:r>
+          </w:p>
+        </w:tc>
+        <w:tc>
+          <w:tcPr>
+            <w:tcW w:w="0" w:type="auto"/>
+            <w:tcBorders>
+              <w:top w:val="single" w:sz="4" w:space="0" w:color="000000"/>
+              <w:left w:val="single" w:sz="4" w:space="0" w:color="000000"/>
+              <w:bottom w:val="single" w:sz="4" w:space="0" w:color="000000"/>
+              <w:right w:val="single" w:sz="4" w:space="0" w:color="000000"/>
+            </w:tcBorders>
+            <w:tcMar>
+              <w:top w:w="100" w:type="dxa"/>
+              <w:left w:w="100" w:type="dxa"/>
+              <w:bottom w:w="100" w:type="dxa"/>
+              <w:right w:w="100" w:type="dxa"/>
+            </w:tcMar>
+          </w:tcPr>
+          <w:p>
+            <w:pPr>
+              <w:rPr>
+                <w:b/>
+                <w:bCs/>
+              </w:rPr>
+            </w:pPr>
+            <w:r>
+              <w:rPr>
+                <w:b/>
+                <w:bCs/>
+              </w:rPr>
+              <w:t>20:00</w:t>
+            </w:r>
+          </w:p>
+        </w:tc>
+        <w:tc>
+          <w:tcPr>
+            <w:tcW w:w="0" w:type="auto"/>
+            <w:tcBorders>
+              <w:top w:val="single" w:sz="4" w:space="0" w:color="000000"/>
+              <w:left w:val="single" w:sz="4" w:space="0" w:color="000000"/>
+              <w:bottom w:val="single" w:sz="4" w:space="0" w:color="000000"/>
+              <w:right w:val="single" w:sz="4" w:space="0" w:color="000000"/>
+            </w:tcBorders>
+            <w:tcMar>
+              <w:top w:w="100" w:type="dxa"/>
+              <w:left w:w="100" w:type="dxa"/>
+              <w:bottom w:w="100" w:type="dxa"/>
+              <w:right w:w="100" w:type="dxa"/>
+            </w:tcMar>
+          </w:tcPr>
+          <w:p>
+            <w:pPr>
+              <w:rPr>
+                <w:b/>
+                <w:bCs/>
+              </w:rPr>
+            </w:pPr>
+            <w:r>
+              <w:rPr>
+                <w:b/>
+                <w:bCs/>
+              </w:rPr>
+              <w:t>20 minutos</w:t>
+            </w:r>
+          </w:p>
+        </w:tc>
+        <w:tc>
+          <w:tcPr>
+            <w:tcW w:w="0" w:type="auto"/>
+            <w:tcBorders>
+              <w:top w:val="single" w:sz="4" w:space="0" w:color="000000"/>
+              <w:left w:val="single" w:sz="4" w:space="0" w:color="000000"/>
+              <w:bottom w:val="single" w:sz="4" w:space="0" w:color="000000"/>
+              <w:right w:val="single" w:sz="4" w:space="0" w:color="000000"/>
+            </w:tcBorders>
+            <w:tcMar>
+              <w:top w:w="100" w:type="dxa"/>
+              <w:left w:w="100" w:type="dxa"/>
+              <w:bottom w:w="100" w:type="dxa"/>
+              <w:right w:w="100" w:type="dxa"/>
+            </w:tcMar>
+          </w:tcPr>
+          <w:p>
+            <w:pPr>
+              <w:rPr>
+                <w:b/>
+                <w:bCs/>
+              </w:rPr>
+            </w:pPr>
+            <w:r>
+              <w:rPr>
+                <w:b/>
+                <w:bCs/>
+              </w:rPr>
+              <w:t>1 hora y 40 minutos</w:t>
+            </w:r>
+          </w:p>
+        </w:tc>
+        <w:tc>
+          <w:tcPr>
+            <w:tcW w:w="0" w:type="auto"/>
+            <w:tcBorders>
+              <w:top w:val="single" w:sz="4" w:space="0" w:color="000000"/>
+              <w:left w:val="single" w:sz="4" w:space="0" w:color="000000"/>
+              <w:bottom w:val="single" w:sz="4" w:space="0" w:color="000000"/>
+              <w:right w:val="single" w:sz="4" w:space="0" w:color="000000"/>
+            </w:tcBorders>
+            <w:tcMar>
+              <w:top w:w="100" w:type="dxa"/>
+              <w:left w:w="100" w:type="dxa"/>
+              <w:bottom w:w="100" w:type="dxa"/>
+              <w:right w:w="100" w:type="dxa"/>
+            </w:tcMar>
+          </w:tcPr>
+          <w:p>
+            <w:pPr>
+              <w:rPr>
+                <w:b/>
+                <w:bCs/>
+              </w:rPr>
+            </w:pPr>
+            <w:r>
+              <w:rPr>
+                <w:b/>
+                <w:bCs/>
+              </w:rPr>
+              <w:t>2</w:t>
+            </w:r>
+          </w:p>
+        </w:tc>
+        <w:tc>
+          <w:tcPr>
+            <w:tcW w:w="0" w:type="auto"/>
+            <w:tcBorders>
+              <w:top w:val="single" w:sz="4" w:space="0" w:color="000000"/>
+              <w:left w:val="single" w:sz="4" w:space="0" w:color="000000"/>
+              <w:bottom w:val="single" w:sz="4" w:space="0" w:color="000000"/>
+              <w:right w:val="single" w:sz="4" w:space="0" w:color="000000"/>
+            </w:tcBorders>
+            <w:tcMar>
+              <w:top w:w="100" w:type="dxa"/>
+              <w:left w:w="100" w:type="dxa"/>
+              <w:bottom w:w="100" w:type="dxa"/>
+              <w:right w:w="100" w:type="dxa"/>
+            </w:tcMar>
+          </w:tcPr>
+          <w:p>
+            <w:pPr>
+              <w:rPr>
+                <w:b/>
+                <w:bCs/>
+              </w:rPr>
+            </w:pPr>
+            <w:r>
+              <w:rPr>
+                <w:b/>
+                <w:bCs/>
+              </w:rPr>
+              <w:t>elaboración con detalle de la interfaz para la v3.</w:t>
+            </w:r>
+          </w:p>
+        </w:tc>
+      </w:tr>
+      <w:tr>
+        <w:tc>
+          <w:tcPr>
+            <w:tcW w:w="0" w:type="auto"/>
+            <w:tcBorders>
+              <w:top w:val="single" w:sz="4" w:space="0" w:color="000000"/>
+              <w:left w:val="single" w:sz="4" w:space="0" w:color="000000"/>
+              <w:bottom w:val="single" w:sz="4" w:space="0" w:color="000000"/>
+              <w:right w:val="single" w:sz="4" w:space="0" w:color="000000"/>
+            </w:tcBorders>
+            <w:tcMar>
+              <w:top w:w="100" w:type="dxa"/>
+              <w:left w:w="100" w:type="dxa"/>
+              <w:bottom w:w="100" w:type="dxa"/>
+              <w:right w:w="100" w:type="dxa"/>
+            </w:tcMar>
+          </w:tcPr>
+          <w:p>
+            <w:pPr>
+              <w:rPr>
+                <w:b/>
+                <w:bCs/>
+              </w:rPr>
+            </w:pPr>
+            <w:r>
+              <w:rPr>
+                <w:b/>
+                <w:bCs/>
+              </w:rPr>
+              <w:t>20/02</w:t>
+            </w:r>
+          </w:p>
+        </w:tc>
+        <w:tc>
+          <w:tcPr>
+            <w:tcW w:w="0" w:type="auto"/>
+            <w:tcBorders>
+              <w:top w:val="single" w:sz="4" w:space="0" w:color="000000"/>
+              <w:left w:val="single" w:sz="4" w:space="0" w:color="000000"/>
+              <w:bottom w:val="single" w:sz="4" w:space="0" w:color="000000"/>
+              <w:right w:val="single" w:sz="4" w:space="0" w:color="000000"/>
+            </w:tcBorders>
+            <w:tcMar>
+              <w:top w:w="100" w:type="dxa"/>
+              <w:left w:w="100" w:type="dxa"/>
+              <w:bottom w:w="100" w:type="dxa"/>
+              <w:right w:w="100" w:type="dxa"/>
+            </w:tcMar>
+          </w:tcPr>
+          <w:p>
+            <w:pPr>
+              <w:rPr>
+                <w:b/>
+                <w:bCs/>
+              </w:rPr>
+            </w:pPr>
+            <w:r>
+              <w:rPr>
+                <w:b/>
+                <w:bCs/>
+              </w:rPr>
+              <w:t>16:00</w:t>
+            </w:r>
+          </w:p>
+        </w:tc>
+        <w:tc>
+          <w:tcPr>
+            <w:tcW w:w="0" w:type="auto"/>
+            <w:tcBorders>
+              <w:top w:val="single" w:sz="4" w:space="0" w:color="000000"/>
+              <w:left w:val="single" w:sz="4" w:space="0" w:color="000000"/>
+              <w:bottom w:val="single" w:sz="4" w:space="0" w:color="000000"/>
+              <w:right w:val="single" w:sz="4" w:space="0" w:color="000000"/>
+            </w:tcBorders>
+            <w:tcMar>
+              <w:top w:w="100" w:type="dxa"/>
+              <w:left w:w="100" w:type="dxa"/>
+              <w:bottom w:w="100" w:type="dxa"/>
+              <w:right w:w="100" w:type="dxa"/>
+            </w:tcMar>
+          </w:tcPr>
+          <w:p>
+            <w:pPr>
+              <w:rPr>
+                <w:b/>
+                <w:bCs/>
+              </w:rPr>
+            </w:pPr>
+            <w:r>
+              <w:rPr>
+                <w:b/>
+                <w:bCs/>
+              </w:rPr>
+              <w:t>17:30</w:t>
+            </w:r>
+          </w:p>
+        </w:tc>
+        <w:tc>
+          <w:tcPr>
+            <w:tcW w:w="0" w:type="auto"/>
+            <w:tcBorders>
+              <w:top w:val="single" w:sz="4" w:space="0" w:color="000000"/>
+              <w:left w:val="single" w:sz="4" w:space="0" w:color="000000"/>
+              <w:bottom w:val="single" w:sz="4" w:space="0" w:color="000000"/>
+              <w:right w:val="single" w:sz="4" w:space="0" w:color="000000"/>
+            </w:tcBorders>
+            <w:tcMar>
+              <w:top w:w="100" w:type="dxa"/>
+              <w:left w:w="100" w:type="dxa"/>
+              <w:bottom w:w="100" w:type="dxa"/>
+              <w:right w:w="100" w:type="dxa"/>
+            </w:tcMar>
+          </w:tcPr>
+          <w:p>
+            <w:pPr>
+              <w:rPr>
+                <w:b/>
+                <w:bCs/>
+              </w:rPr>
+            </w:pPr>
+            <w:r>
+              <w:rPr>
+                <w:b/>
+                <w:bCs/>
+              </w:rPr>
+              <w:t>30 minutos</w:t>
+            </w:r>
+          </w:p>
+        </w:tc>
+        <w:tc>
+          <w:tcPr>
+            <w:tcW w:w="0" w:type="auto"/>
+            <w:tcBorders>
+              <w:top w:val="single" w:sz="4" w:space="0" w:color="000000"/>
+              <w:left w:val="single" w:sz="4" w:space="0" w:color="000000"/>
+              <w:bottom w:val="single" w:sz="4" w:space="0" w:color="000000"/>
+              <w:right w:val="single" w:sz="4" w:space="0" w:color="000000"/>
+            </w:tcBorders>
+            <w:tcMar>
+              <w:top w:w="100" w:type="dxa"/>
+              <w:left w:w="100" w:type="dxa"/>
+              <w:bottom w:w="100" w:type="dxa"/>
+              <w:right w:w="100" w:type="dxa"/>
+            </w:tcMar>
+          </w:tcPr>
+          <w:p>
+            <w:pPr>
+              <w:rPr>
+                <w:b/>
+                <w:bCs/>
+              </w:rPr>
+            </w:pPr>
+            <w:r>
+              <w:rPr>
+                <w:b/>
+                <w:bCs/>
+              </w:rPr>
+              <w:t>1 hora</w:t>
+            </w:r>
+          </w:p>
+        </w:tc>
+        <w:tc>
+          <w:tcPr>
+            <w:tcW w:w="0" w:type="auto"/>
+            <w:tcBorders>
+              <w:top w:val="single" w:sz="4" w:space="0" w:color="000000"/>
+              <w:left w:val="single" w:sz="4" w:space="0" w:color="000000"/>
+              <w:bottom w:val="single" w:sz="4" w:space="0" w:color="000000"/>
+              <w:right w:val="single" w:sz="4" w:space="0" w:color="000000"/>
+            </w:tcBorders>
+            <w:tcMar>
+              <w:top w:w="100" w:type="dxa"/>
+              <w:left w:w="100" w:type="dxa"/>
+              <w:bottom w:w="100" w:type="dxa"/>
+              <w:right w:w="100" w:type="dxa"/>
+            </w:tcMar>
+          </w:tcPr>
+          <w:p>
+            <w:pPr>
+              <w:rPr>
+                <w:b/>
+                <w:bCs/>
+              </w:rPr>
+            </w:pPr>
+            <w:r>
+              <w:rPr>
+                <w:b/>
+                <w:bCs/>
+              </w:rPr>
+              <w:t>2</w:t>
+            </w:r>
+          </w:p>
+        </w:tc>
+        <w:tc>
+          <w:tcPr>
+            <w:tcW w:w="0" w:type="auto"/>
+            <w:tcBorders>
+              <w:top w:val="single" w:sz="4" w:space="0" w:color="000000"/>
+              <w:left w:val="single" w:sz="4" w:space="0" w:color="000000"/>
+              <w:bottom w:val="single" w:sz="4" w:space="0" w:color="000000"/>
+              <w:right w:val="single" w:sz="4" w:space="0" w:color="000000"/>
+            </w:tcBorders>
+            <w:tcMar>
+              <w:top w:w="100" w:type="dxa"/>
+              <w:left w:w="100" w:type="dxa"/>
+              <w:bottom w:w="100" w:type="dxa"/>
+              <w:right w:w="100" w:type="dxa"/>
+            </w:tcMar>
+          </w:tcPr>
+          <w:p>
+            <w:pPr>
+              <w:rPr>
+                <w:b/>
+                <w:bCs/>
+              </w:rPr>
+            </w:pPr>
+            <w:r>
+              <w:rPr>
+                <w:b/>
+                <w:bCs/>
+              </w:rPr>
+              <w:t>Recolección</w:t>
+            </w:r>
+            <w:r>
+              <w:rPr>
+                <w:b/>
+                <w:bCs/>
+              </w:rPr>
+              <w:t xml:space="preserve"> de opiniones de los </w:t>
+            </w:r>
+            <w:proofErr w:type="spellStart"/>
+            <w:r>
+              <w:rPr>
+                <w:b/>
+                <w:bCs/>
+              </w:rPr>
+              <w:t>users</w:t>
+            </w:r>
+            <w:proofErr w:type="spellEnd"/>
+            <w:r>
+              <w:rPr>
+                <w:b/>
+                <w:bCs/>
+              </w:rPr>
+              <w:t xml:space="preserve"> de la v</w:t>
+            </w:r>
+            <w:r>
+              <w:rPr>
+                <w:b/>
+                <w:bCs/>
+              </w:rPr>
+              <w:t>2</w:t>
+            </w:r>
+            <w:r>
+              <w:rPr>
+                <w:b/>
+                <w:bCs/>
+              </w:rPr>
+              <w:t>.</w:t>
+            </w:r>
+          </w:p>
+        </w:tc>
+      </w:tr>
+      <w:tr>
+        <w:tc>
+          <w:tcPr>
+            <w:tcW w:w="0" w:type="auto"/>
+            <w:tcBorders>
+              <w:top w:val="single" w:sz="4" w:space="0" w:color="000000"/>
+              <w:left w:val="single" w:sz="4" w:space="0" w:color="000000"/>
+              <w:bottom w:val="single" w:sz="4" w:space="0" w:color="000000"/>
+              <w:right w:val="single" w:sz="4" w:space="0" w:color="000000"/>
+            </w:tcBorders>
+            <w:tcMar>
+              <w:top w:w="100" w:type="dxa"/>
+              <w:left w:w="100" w:type="dxa"/>
+              <w:bottom w:w="100" w:type="dxa"/>
+              <w:right w:w="100" w:type="dxa"/>
+            </w:tcMar>
+          </w:tcPr>
+          <w:p>
+            <w:pPr>
+              <w:rPr>
+                <w:b/>
+                <w:bCs/>
+              </w:rPr>
+            </w:pPr>
+            <w:r>
+              <w:rPr>
+                <w:b/>
+                <w:bCs/>
+              </w:rPr>
+              <w:t>19/02</w:t>
+            </w:r>
+          </w:p>
+        </w:tc>
+        <w:tc>
+          <w:tcPr>
+            <w:tcW w:w="0" w:type="auto"/>
+            <w:tcBorders>
+              <w:top w:val="single" w:sz="4" w:space="0" w:color="000000"/>
+              <w:left w:val="single" w:sz="4" w:space="0" w:color="000000"/>
+              <w:bottom w:val="single" w:sz="4" w:space="0" w:color="000000"/>
+              <w:right w:val="single" w:sz="4" w:space="0" w:color="000000"/>
+            </w:tcBorders>
+            <w:tcMar>
+              <w:top w:w="100" w:type="dxa"/>
+              <w:left w:w="100" w:type="dxa"/>
+              <w:bottom w:w="100" w:type="dxa"/>
+              <w:right w:w="100" w:type="dxa"/>
+            </w:tcMar>
+          </w:tcPr>
+          <w:p>
+            <w:pPr>
+              <w:rPr>
+                <w:b/>
+                <w:bCs/>
+              </w:rPr>
+            </w:pPr>
+            <w:r>
+              <w:rPr>
+                <w:b/>
+                <w:bCs/>
+              </w:rPr>
+              <w:t>11:00</w:t>
+            </w:r>
+          </w:p>
+        </w:tc>
+        <w:tc>
+          <w:tcPr>
+            <w:tcW w:w="0" w:type="auto"/>
+            <w:tcBorders>
+              <w:top w:val="single" w:sz="4" w:space="0" w:color="000000"/>
+              <w:left w:val="single" w:sz="4" w:space="0" w:color="000000"/>
+              <w:bottom w:val="single" w:sz="4" w:space="0" w:color="000000"/>
+              <w:right w:val="single" w:sz="4" w:space="0" w:color="000000"/>
+            </w:tcBorders>
+            <w:tcMar>
+              <w:top w:w="100" w:type="dxa"/>
+              <w:left w:w="100" w:type="dxa"/>
+              <w:bottom w:w="100" w:type="dxa"/>
+              <w:right w:w="100" w:type="dxa"/>
+            </w:tcMar>
+          </w:tcPr>
+          <w:p>
+            <w:pPr>
+              <w:rPr>
+                <w:b/>
+                <w:bCs/>
+              </w:rPr>
+            </w:pPr>
+            <w:r>
+              <w:rPr>
+                <w:b/>
+                <w:bCs/>
+              </w:rPr>
+              <w:t>12:30</w:t>
+            </w:r>
+          </w:p>
+        </w:tc>
+        <w:tc>
+          <w:tcPr>
+            <w:tcW w:w="0" w:type="auto"/>
+            <w:tcBorders>
+              <w:top w:val="single" w:sz="4" w:space="0" w:color="000000"/>
+              <w:left w:val="single" w:sz="4" w:space="0" w:color="000000"/>
+              <w:bottom w:val="single" w:sz="4" w:space="0" w:color="000000"/>
+              <w:right w:val="single" w:sz="4" w:space="0" w:color="000000"/>
+            </w:tcBorders>
+            <w:tcMar>
+              <w:top w:w="100" w:type="dxa"/>
+              <w:left w:w="100" w:type="dxa"/>
+              <w:bottom w:w="100" w:type="dxa"/>
+              <w:right w:w="100" w:type="dxa"/>
+            </w:tcMar>
+          </w:tcPr>
+          <w:p>
+            <w:pPr>
+              <w:rPr>
+                <w:b/>
+                <w:bCs/>
+              </w:rPr>
+            </w:pPr>
+            <w:r>
+              <w:rPr>
+                <w:b/>
+                <w:bCs/>
+              </w:rPr>
+              <w:t>15 minutos</w:t>
+            </w:r>
+          </w:p>
+        </w:tc>
+        <w:tc>
+          <w:tcPr>
+            <w:tcW w:w="0" w:type="auto"/>
+            <w:tcBorders>
+              <w:top w:val="single" w:sz="4" w:space="0" w:color="000000"/>
+              <w:left w:val="single" w:sz="4" w:space="0" w:color="000000"/>
+              <w:bottom w:val="single" w:sz="4" w:space="0" w:color="000000"/>
+              <w:right w:val="single" w:sz="4" w:space="0" w:color="000000"/>
+            </w:tcBorders>
+            <w:tcMar>
+              <w:top w:w="100" w:type="dxa"/>
+              <w:left w:w="100" w:type="dxa"/>
+              <w:bottom w:w="100" w:type="dxa"/>
+              <w:right w:w="100" w:type="dxa"/>
+            </w:tcMar>
+          </w:tcPr>
+          <w:p>
+            <w:pPr>
+              <w:rPr>
+                <w:b/>
+                <w:bCs/>
+              </w:rPr>
+            </w:pPr>
+            <w:r>
+              <w:rPr>
+                <w:b/>
+                <w:bCs/>
+              </w:rPr>
+              <w:t>1 hora 15 minutos</w:t>
+            </w:r>
+          </w:p>
+        </w:tc>
+        <w:tc>
+          <w:tcPr>
+            <w:tcW w:w="0" w:type="auto"/>
+            <w:tcBorders>
+              <w:top w:val="single" w:sz="4" w:space="0" w:color="000000"/>
+              <w:left w:val="single" w:sz="4" w:space="0" w:color="000000"/>
+              <w:bottom w:val="single" w:sz="4" w:space="0" w:color="000000"/>
+              <w:right w:val="single" w:sz="4" w:space="0" w:color="000000"/>
+            </w:tcBorders>
+            <w:tcMar>
+              <w:top w:w="100" w:type="dxa"/>
+              <w:left w:w="100" w:type="dxa"/>
+              <w:bottom w:w="100" w:type="dxa"/>
+              <w:right w:w="100" w:type="dxa"/>
+            </w:tcMar>
+          </w:tcPr>
+          <w:p>
+            <w:pPr>
+              <w:rPr>
+                <w:b/>
+                <w:bCs/>
+              </w:rPr>
+            </w:pPr>
+            <w:r>
+              <w:rPr>
+                <w:b/>
+                <w:bCs/>
+              </w:rPr>
+              <w:t>2</w:t>
+            </w:r>
+          </w:p>
+        </w:tc>
+        <w:tc>
+          <w:tcPr>
+            <w:tcW w:w="0" w:type="auto"/>
+            <w:tcBorders>
+              <w:top w:val="single" w:sz="4" w:space="0" w:color="000000"/>
+              <w:left w:val="single" w:sz="4" w:space="0" w:color="000000"/>
+              <w:bottom w:val="single" w:sz="4" w:space="0" w:color="000000"/>
+              <w:right w:val="single" w:sz="4" w:space="0" w:color="000000"/>
+            </w:tcBorders>
+            <w:tcMar>
+              <w:top w:w="100" w:type="dxa"/>
+              <w:left w:w="100" w:type="dxa"/>
+              <w:bottom w:w="100" w:type="dxa"/>
+              <w:right w:w="100" w:type="dxa"/>
+            </w:tcMar>
+          </w:tcPr>
+          <w:p>
+            <w:pPr>
+              <w:rPr>
+                <w:b/>
+                <w:bCs/>
+              </w:rPr>
+            </w:pPr>
+            <w:r>
+              <w:rPr>
+                <w:b/>
+                <w:bCs/>
+              </w:rPr>
+              <w:t xml:space="preserve">Elaboración de prototipos de la interfaz </w:t>
+            </w:r>
+            <w:proofErr w:type="spellStart"/>
+            <w:r>
+              <w:rPr>
+                <w:b/>
+                <w:bCs/>
+              </w:rPr>
+              <w:t>grafica</w:t>
+            </w:r>
+            <w:proofErr w:type="spellEnd"/>
+            <w:r>
+              <w:rPr>
+                <w:b/>
+                <w:bCs/>
+              </w:rPr>
+              <w:t xml:space="preserve"> de la v2.</w:t>
+            </w:r>
+          </w:p>
+        </w:tc>
+      </w:tr>
+      <w:tr>
+        <w:tc>
+          <w:tcPr>
+            <w:tcW w:w="0" w:type="auto"/>
+            <w:tcBorders>
+              <w:top w:val="single" w:sz="4" w:space="0" w:color="000000"/>
+              <w:left w:val="single" w:sz="4" w:space="0" w:color="000000"/>
+              <w:bottom w:val="single" w:sz="4" w:space="0" w:color="000000"/>
+              <w:right w:val="single" w:sz="4" w:space="0" w:color="000000"/>
+            </w:tcBorders>
+            <w:tcMar>
+              <w:top w:w="100" w:type="dxa"/>
+              <w:left w:w="100" w:type="dxa"/>
+              <w:bottom w:w="100" w:type="dxa"/>
+              <w:right w:w="100" w:type="dxa"/>
+            </w:tcMar>
+          </w:tcPr>
+          <w:p>
+            <w:pPr>
+              <w:rPr>
+                <w:b/>
+                <w:bCs/>
+              </w:rPr>
+            </w:pPr>
+            <w:r>
+              <w:rPr>
+                <w:b/>
+                <w:bCs/>
+              </w:rPr>
+              <w:t>16/02</w:t>
+            </w:r>
+          </w:p>
+        </w:tc>
+        <w:tc>
+          <w:tcPr>
+            <w:tcW w:w="0" w:type="auto"/>
+            <w:tcBorders>
+              <w:top w:val="single" w:sz="4" w:space="0" w:color="000000"/>
+              <w:left w:val="single" w:sz="4" w:space="0" w:color="000000"/>
+              <w:bottom w:val="single" w:sz="4" w:space="0" w:color="000000"/>
+              <w:right w:val="single" w:sz="4" w:space="0" w:color="000000"/>
+            </w:tcBorders>
+            <w:tcMar>
+              <w:top w:w="100" w:type="dxa"/>
+              <w:left w:w="100" w:type="dxa"/>
+              <w:bottom w:w="100" w:type="dxa"/>
+              <w:right w:w="100" w:type="dxa"/>
+            </w:tcMar>
+          </w:tcPr>
+          <w:p>
+            <w:pPr>
+              <w:rPr>
+                <w:b/>
+                <w:bCs/>
+              </w:rPr>
+            </w:pPr>
+            <w:r>
+              <w:rPr>
+                <w:b/>
+                <w:bCs/>
+              </w:rPr>
+              <w:t>14:30</w:t>
+            </w:r>
+          </w:p>
+        </w:tc>
+        <w:tc>
+          <w:tcPr>
+            <w:tcW w:w="0" w:type="auto"/>
+            <w:tcBorders>
+              <w:top w:val="single" w:sz="4" w:space="0" w:color="000000"/>
+              <w:left w:val="single" w:sz="4" w:space="0" w:color="000000"/>
+              <w:bottom w:val="single" w:sz="4" w:space="0" w:color="000000"/>
+              <w:right w:val="single" w:sz="4" w:space="0" w:color="000000"/>
+            </w:tcBorders>
+            <w:tcMar>
+              <w:top w:w="100" w:type="dxa"/>
+              <w:left w:w="100" w:type="dxa"/>
+              <w:bottom w:w="100" w:type="dxa"/>
+              <w:right w:w="100" w:type="dxa"/>
+            </w:tcMar>
+          </w:tcPr>
+          <w:p>
+            <w:pPr>
+              <w:rPr>
+                <w:b/>
+                <w:bCs/>
+              </w:rPr>
+            </w:pPr>
+            <w:r>
+              <w:rPr>
+                <w:b/>
+                <w:bCs/>
+              </w:rPr>
+              <w:t>15:30</w:t>
+            </w:r>
+          </w:p>
+        </w:tc>
+        <w:tc>
+          <w:tcPr>
+            <w:tcW w:w="0" w:type="auto"/>
+            <w:tcBorders>
+              <w:top w:val="single" w:sz="4" w:space="0" w:color="000000"/>
+              <w:left w:val="single" w:sz="4" w:space="0" w:color="000000"/>
+              <w:bottom w:val="single" w:sz="4" w:space="0" w:color="000000"/>
+              <w:right w:val="single" w:sz="4" w:space="0" w:color="000000"/>
+            </w:tcBorders>
+            <w:tcMar>
+              <w:top w:w="100" w:type="dxa"/>
+              <w:left w:w="100" w:type="dxa"/>
+              <w:bottom w:w="100" w:type="dxa"/>
+              <w:right w:w="100" w:type="dxa"/>
+            </w:tcMar>
+          </w:tcPr>
+          <w:p>
+            <w:pPr>
+              <w:rPr>
+                <w:b/>
+                <w:bCs/>
+              </w:rPr>
+            </w:pPr>
+          </w:p>
+        </w:tc>
+        <w:tc>
+          <w:tcPr>
+            <w:tcW w:w="0" w:type="auto"/>
+            <w:tcBorders>
+              <w:top w:val="single" w:sz="4" w:space="0" w:color="000000"/>
+              <w:left w:val="single" w:sz="4" w:space="0" w:color="000000"/>
+              <w:bottom w:val="single" w:sz="4" w:space="0" w:color="000000"/>
+              <w:right w:val="single" w:sz="4" w:space="0" w:color="000000"/>
+            </w:tcBorders>
+            <w:tcMar>
+              <w:top w:w="100" w:type="dxa"/>
+              <w:left w:w="100" w:type="dxa"/>
+              <w:bottom w:w="100" w:type="dxa"/>
+              <w:right w:w="100" w:type="dxa"/>
+            </w:tcMar>
+          </w:tcPr>
+          <w:p>
+            <w:pPr>
+              <w:rPr>
+                <w:b/>
+                <w:bCs/>
+              </w:rPr>
+            </w:pPr>
+            <w:r>
+              <w:rPr>
+                <w:b/>
+                <w:bCs/>
+              </w:rPr>
+              <w:t xml:space="preserve">1 hora </w:t>
+            </w:r>
+          </w:p>
+        </w:tc>
+        <w:tc>
+          <w:tcPr>
+            <w:tcW w:w="0" w:type="auto"/>
+            <w:tcBorders>
+              <w:top w:val="single" w:sz="4" w:space="0" w:color="000000"/>
+              <w:left w:val="single" w:sz="4" w:space="0" w:color="000000"/>
+              <w:bottom w:val="single" w:sz="4" w:space="0" w:color="000000"/>
+              <w:right w:val="single" w:sz="4" w:space="0" w:color="000000"/>
+            </w:tcBorders>
+            <w:tcMar>
+              <w:top w:w="100" w:type="dxa"/>
+              <w:left w:w="100" w:type="dxa"/>
+              <w:bottom w:w="100" w:type="dxa"/>
+              <w:right w:w="100" w:type="dxa"/>
+            </w:tcMar>
+          </w:tcPr>
+          <w:p>
+            <w:pPr>
+              <w:rPr>
+                <w:b/>
+                <w:bCs/>
+              </w:rPr>
+            </w:pPr>
+            <w:r>
+              <w:rPr>
+                <w:b/>
+                <w:bCs/>
+              </w:rPr>
+              <w:t>2</w:t>
+            </w:r>
+          </w:p>
+        </w:tc>
+        <w:tc>
+          <w:tcPr>
+            <w:tcW w:w="0" w:type="auto"/>
+            <w:tcBorders>
+              <w:top w:val="single" w:sz="4" w:space="0" w:color="000000"/>
+              <w:left w:val="single" w:sz="4" w:space="0" w:color="000000"/>
+              <w:bottom w:val="single" w:sz="4" w:space="0" w:color="000000"/>
+              <w:right w:val="single" w:sz="4" w:space="0" w:color="000000"/>
+            </w:tcBorders>
+            <w:tcMar>
+              <w:top w:w="100" w:type="dxa"/>
+              <w:left w:w="100" w:type="dxa"/>
+              <w:bottom w:w="100" w:type="dxa"/>
+              <w:right w:w="100" w:type="dxa"/>
+            </w:tcMar>
+          </w:tcPr>
+          <w:p>
+            <w:pPr>
+              <w:rPr>
+                <w:b/>
+                <w:bCs/>
+              </w:rPr>
+            </w:pPr>
+            <w:r>
+              <w:rPr>
+                <w:b/>
+                <w:bCs/>
+              </w:rPr>
+              <w:t xml:space="preserve">Recolección de opiniones de los </w:t>
+            </w:r>
+            <w:proofErr w:type="spellStart"/>
+            <w:r>
+              <w:rPr>
+                <w:b/>
+                <w:bCs/>
+              </w:rPr>
+              <w:t>users</w:t>
+            </w:r>
+            <w:proofErr w:type="spellEnd"/>
+            <w:r>
+              <w:rPr>
+                <w:b/>
+                <w:bCs/>
+              </w:rPr>
+              <w:t xml:space="preserve"> de la v1.</w:t>
+            </w:r>
+          </w:p>
+        </w:tc>
+      </w:tr>
+      <w:tr>
+        <w:tc>
+          <w:tcPr>
+            <w:tcW w:w="0" w:type="auto"/>
+            <w:tcBorders>
+              <w:top w:val="single" w:sz="4" w:space="0" w:color="000000"/>
+              <w:left w:val="single" w:sz="4" w:space="0" w:color="000000"/>
+              <w:bottom w:val="single" w:sz="4" w:space="0" w:color="000000"/>
+              <w:right w:val="single" w:sz="4" w:space="0" w:color="000000"/>
+            </w:tcBorders>
+            <w:tcMar>
+              <w:top w:w="100" w:type="dxa"/>
+              <w:left w:w="100" w:type="dxa"/>
+              <w:bottom w:w="100" w:type="dxa"/>
+              <w:right w:w="100" w:type="dxa"/>
+            </w:tcMar>
+          </w:tcPr>
+          <w:p>
             <w:r>
               <w:t>15/02</w:t>
             </w:r>
@@ -369,15 +1335,10 @@
           </w:tcPr>
           <w:p>
             <w:r>
-              <w:t xml:space="preserve">Boceto inicial de las paginas principales de la </w:t>
-            </w:r>
-            <w:proofErr w:type="gramStart"/>
-            <w:r>
-              <w:t>app</w:t>
-            </w:r>
-            <w:proofErr w:type="gramEnd"/>
-            <w:r>
-              <w:t>.</w:t>
+              <w:t>Boceto inicial de las paginas principales de la app</w:t>
+            </w:r>
+            <w:r>
+              <w:t xml:space="preserve"> de la v1.</w:t>
             </w:r>
           </w:p>
         </w:tc>
@@ -542,13 +1503,8 @@
             <w:hideMark/>
           </w:tcPr>
           <w:p>
-            <w:proofErr w:type="gramStart"/>
-            <w:r>
-              <w:t>Elaboración de la técnica de “Cómo podríamos?</w:t>
-            </w:r>
-            <w:proofErr w:type="gramEnd"/>
-            <w:r>
-              <w:t>”</w:t>
+            <w:r>
+              <w:t>Elaboración de la técnica de “Cómo podríamos?”</w:t>
             </w:r>
           </w:p>
         </w:tc>
@@ -1330,6 +2286,7 @@
   <w:style w:type="character" w:default="1" w:styleId="Fuentedeprrafopredeter">
     <w:name w:val="Default Paragraph Font"/>
     <w:uiPriority w:val="1"/>
+    <w:semiHidden/>
     <w:unhideWhenUsed/>
   </w:style>
   <w:style w:type="table" w:default="1" w:styleId="Tablanormal">

</xml_diff>